<commit_message>
Add initial draft of Assignment 5.2 by Gabriel Vance
</commit_message>
<xml_diff>
--- a/fall2025/dsc630_data_prediction/Milestone 1.docx
+++ b/fall2025/dsc630_data_prediction/Milestone 1.docx
@@ -5,61 +5,51 @@
     <w:p>
       <w:pPr>
         <w:jc w:val="center"/>
-      </w:pPr>
-      <w:r>
+        <w:rPr>
+          <w:rFonts w:ascii="Times New Roman" w:hAnsi="Times New Roman" w:cs="Times New Roman"/>
+          <w:sz w:val="40"/>
+          <w:szCs w:val="40"/>
+        </w:rPr>
+      </w:pPr>
+      <w:r>
+        <w:rPr>
+          <w:rFonts w:ascii="Times New Roman" w:hAnsi="Times New Roman" w:cs="Times New Roman"/>
+          <w:sz w:val="40"/>
+          <w:szCs w:val="40"/>
+        </w:rPr>
         <w:t>Milestone 1 - Team Information/Communication Plan</w:t>
       </w:r>
     </w:p>
     <w:p>
       <w:pPr>
         <w:ind w:firstLine="720"/>
-      </w:pPr>
-      <w:r>
+        <w:rPr>
+          <w:rFonts w:ascii="Times New Roman" w:hAnsi="Times New Roman" w:cs="Times New Roman"/>
+        </w:rPr>
+      </w:pPr>
+      <w:r>
+        <w:rPr>
+          <w:rFonts w:ascii="Times New Roman" w:hAnsi="Times New Roman" w:cs="Times New Roman"/>
+        </w:rPr>
         <w:t>This term project will be done individually. As such, I, Gabriel Vance, will be the only person doing and submitting work.</w:t>
       </w:r>
     </w:p>
     <w:p>
-      <w:r>
-        <w:tab/>
-        <w:t>For the term project, I’ve chosen the topic of fake news. I’ve already found this set on Kaggle:</w:t>
-      </w:r>
-      <w:r>
-        <w:br/>
-      </w:r>
-      <w:r>
-        <w:br/>
-      </w:r>
-      <w:hyperlink r:id="rId7" w:history="1">
-        <w:r>
-          <w:rPr>
-            <w:rStyle w:val="Hyperlink"/>
-          </w:rPr>
-          <w:t>https://www.kaggle.com/datasets/algord/fake-news</w:t>
-        </w:r>
-      </w:hyperlink>
-    </w:p>
-    <w:p/>
-    <w:p>
-      <w:r>
-        <w:t xml:space="preserve">Additional data can be found at the </w:t>
-      </w:r>
-      <w:proofErr w:type="spellStart"/>
-      <w:r>
-        <w:t>FakeNewsNet</w:t>
-      </w:r>
-      <w:proofErr w:type="spellEnd"/>
-      <w:r>
-        <w:t xml:space="preserve"> </w:t>
-      </w:r>
-      <w:r>
-        <w:t>GitHub</w:t>
-      </w:r>
-      <w:r>
-        <w:t xml:space="preserve">, which further breaks down news into gossip and news/politics. All forms of data have labels for true and real data, so we will be pursuing a binary classification format. For processing and training, we will use natural language processors. Additionally, we will use sentiment analysis to categorize news and keyword searches to find hot-topic items. </w:t>
-      </w:r>
-    </w:p>
-    <w:p>
-      <w:r>
+      <w:pPr>
+        <w:rPr>
+          <w:rFonts w:ascii="Times New Roman" w:hAnsi="Times New Roman" w:cs="Times New Roman"/>
+          <w:sz w:val="28"/>
+          <w:szCs w:val="28"/>
+          <w:u w:val="single"/>
+        </w:rPr>
+      </w:pPr>
+      <w:r>
+        <w:rPr>
+          <w:rFonts w:ascii="Times New Roman" w:hAnsi="Times New Roman" w:cs="Times New Roman"/>
+          <w:sz w:val="28"/>
+          <w:szCs w:val="28"/>
+          <w:u w:val="single"/>
+        </w:rPr>
         <w:t>Week 1: Milestone 1 Due (Team Information/Communication Plan)</w:t>
       </w:r>
     </w:p>
@@ -70,14 +60,20 @@
           <w:ilvl w:val="0"/>
           <w:numId w:val="4"/>
         </w:numPr>
-      </w:pPr>
-      <w:r>
-        <w:t>This term project will be done individually. As such, I, Gabriel Vance, will be the only person doing and submitting work.</w:t>
-      </w:r>
-      <w:r>
-        <w:t xml:space="preserve"> This document will serve as the schedule/outline</w:t>
-      </w:r>
-      <w:r>
+        <w:rPr>
+          <w:rFonts w:ascii="Times New Roman" w:hAnsi="Times New Roman" w:cs="Times New Roman"/>
+        </w:rPr>
+      </w:pPr>
+      <w:r>
+        <w:rPr>
+          <w:rFonts w:ascii="Times New Roman" w:hAnsi="Times New Roman" w:cs="Times New Roman"/>
+        </w:rPr>
+        <w:t>This term project will be done individually. As such, I, Gabriel Vance, will be the only person doing and submitting work. This document will serve as the schedule/outline</w:t>
+      </w:r>
+      <w:r>
+        <w:rPr>
+          <w:rFonts w:ascii="Times New Roman" w:hAnsi="Times New Roman" w:cs="Times New Roman"/>
+        </w:rPr>
         <w:t>.</w:t>
       </w:r>
     </w:p>
@@ -88,19 +84,47 @@
           <w:ilvl w:val="0"/>
           <w:numId w:val="4"/>
         </w:numPr>
-      </w:pPr>
-      <w:r>
+        <w:rPr>
+          <w:rFonts w:ascii="Times New Roman" w:hAnsi="Times New Roman" w:cs="Times New Roman"/>
+        </w:rPr>
+      </w:pPr>
+      <w:r>
+        <w:rPr>
+          <w:rFonts w:ascii="Times New Roman" w:hAnsi="Times New Roman" w:cs="Times New Roman"/>
+        </w:rPr>
         <w:t>I will read through the various milestones/week and outline a schedule.</w:t>
       </w:r>
     </w:p>
     <w:p>
-      <w:r>
+      <w:pPr>
+        <w:rPr>
+          <w:rFonts w:ascii="Times New Roman" w:hAnsi="Times New Roman" w:cs="Times New Roman"/>
+        </w:rPr>
+      </w:pPr>
+      <w:r>
+        <w:rPr>
+          <w:rFonts w:ascii="Times New Roman" w:hAnsi="Times New Roman" w:cs="Times New Roman"/>
+        </w:rPr>
+        <w:t>Submission: This document submitted to Blackboard.</w:t>
+      </w:r>
+    </w:p>
+    <w:p>
+      <w:pPr>
+        <w:rPr>
+          <w:rFonts w:ascii="Times New Roman" w:hAnsi="Times New Roman" w:cs="Times New Roman"/>
+          <w:sz w:val="28"/>
+          <w:szCs w:val="28"/>
+          <w:u w:val="single"/>
+        </w:rPr>
+      </w:pPr>
+      <w:r>
+        <w:rPr>
+          <w:rFonts w:ascii="Times New Roman" w:hAnsi="Times New Roman" w:cs="Times New Roman"/>
+          <w:sz w:val="28"/>
+          <w:szCs w:val="28"/>
+          <w:u w:val="single"/>
+        </w:rPr>
         <w:t>Week 2: Milestone 2 Due (Data Selection and Project Proposal)</w:t>
-      </w:r>
-    </w:p>
-    <w:p>
-      <w:r>
-        <w:t xml:space="preserve">Tasks: </w:t>
       </w:r>
     </w:p>
     <w:p>
@@ -110,16 +134,26 @@
           <w:ilvl w:val="0"/>
           <w:numId w:val="4"/>
         </w:numPr>
-      </w:pPr>
-      <w:r>
+        <w:rPr>
+          <w:rFonts w:ascii="Times New Roman" w:hAnsi="Times New Roman" w:cs="Times New Roman"/>
+        </w:rPr>
+      </w:pPr>
+      <w:r>
+        <w:rPr>
+          <w:rFonts w:ascii="Times New Roman" w:hAnsi="Times New Roman" w:cs="Times New Roman"/>
+        </w:rPr>
         <w:t xml:space="preserve">Decide project proposal. Should be a problem a CEO will explain to a board </w:t>
       </w:r>
-      <w:proofErr w:type="gramStart"/>
-      <w:r>
-        <w:t>meeting/shareholders</w:t>
-      </w:r>
-      <w:proofErr w:type="gramEnd"/>
-      <w:r>
+      <w:r>
+        <w:rPr>
+          <w:rFonts w:ascii="Times New Roman" w:hAnsi="Times New Roman" w:cs="Times New Roman"/>
+        </w:rPr>
+        <w:t>meeting/shareholder</w:t>
+      </w:r>
+      <w:r>
+        <w:rPr>
+          <w:rFonts w:ascii="Times New Roman" w:hAnsi="Times New Roman" w:cs="Times New Roman"/>
+        </w:rPr>
         <w:t>.</w:t>
       </w:r>
     </w:p>
@@ -130,12 +164,39 @@
           <w:ilvl w:val="0"/>
           <w:numId w:val="4"/>
         </w:numPr>
-      </w:pPr>
-      <w:r>
+        <w:rPr>
+          <w:rFonts w:ascii="Times New Roman" w:hAnsi="Times New Roman" w:cs="Times New Roman"/>
+        </w:rPr>
+      </w:pPr>
+      <w:r>
+        <w:rPr>
+          <w:rFonts w:ascii="Times New Roman" w:hAnsi="Times New Roman" w:cs="Times New Roman"/>
+        </w:rPr>
         <w:t xml:space="preserve">Select data. </w:t>
       </w:r>
       <w:r>
+        <w:rPr>
+          <w:rFonts w:ascii="Times New Roman" w:hAnsi="Times New Roman" w:cs="Times New Roman"/>
+        </w:rPr>
         <w:t>This will likely be chosen from CSVs on Kaggle/GitHub.</w:t>
+      </w:r>
+      <w:r>
+        <w:rPr>
+          <w:rFonts w:ascii="Times New Roman" w:hAnsi="Times New Roman" w:cs="Times New Roman"/>
+        </w:rPr>
+        <w:t xml:space="preserve"> We will do some</w:t>
+      </w:r>
+      <w:r>
+        <w:rPr>
+          <w:rFonts w:ascii="Times New Roman" w:hAnsi="Times New Roman" w:cs="Times New Roman"/>
+        </w:rPr>
+        <w:t xml:space="preserve"> preliminary</w:t>
+      </w:r>
+      <w:r>
+        <w:rPr>
+          <w:rFonts w:ascii="Times New Roman" w:hAnsi="Times New Roman" w:cs="Times New Roman"/>
+        </w:rPr>
+        <w:t xml:space="preserve"> analysis to ensure the proposal and data properly align.</w:t>
       </w:r>
     </w:p>
     <w:p>
@@ -145,11 +206,20 @@
           <w:ilvl w:val="0"/>
           <w:numId w:val="4"/>
         </w:numPr>
-      </w:pPr>
-      <w:r>
+        <w:rPr>
+          <w:rFonts w:ascii="Times New Roman" w:hAnsi="Times New Roman" w:cs="Times New Roman"/>
+        </w:rPr>
+      </w:pPr>
+      <w:r>
+        <w:rPr>
+          <w:rFonts w:ascii="Times New Roman" w:hAnsi="Times New Roman" w:cs="Times New Roman"/>
+        </w:rPr>
         <w:t xml:space="preserve">Write paper related to data selection. </w:t>
       </w:r>
       <w:r>
+        <w:rPr>
+          <w:rFonts w:ascii="Times New Roman" w:hAnsi="Times New Roman" w:cs="Times New Roman"/>
+        </w:rPr>
         <w:t>Additionally answer these questions:</w:t>
       </w:r>
     </w:p>
@@ -163,7 +233,7 @@
         <w:shd w:val="clear" w:color="auto" w:fill="FFFFFF"/>
         <w:spacing w:after="0" w:line="240" w:lineRule="auto"/>
         <w:rPr>
-          <w:rFonts w:ascii="Open Sans" w:eastAsia="Times New Roman" w:hAnsi="Open Sans" w:cs="Open Sans"/>
+          <w:rFonts w:ascii="Times New Roman" w:eastAsia="Times New Roman" w:hAnsi="Times New Roman" w:cs="Times New Roman"/>
           <w:color w:val="262626"/>
           <w:kern w:val="0"/>
           <w:sz w:val="21"/>
@@ -173,7 +243,7 @@
       </w:pPr>
       <w:r>
         <w:rPr>
-          <w:rFonts w:ascii="Open Sans" w:eastAsia="Times New Roman" w:hAnsi="Open Sans" w:cs="Open Sans"/>
+          <w:rFonts w:ascii="Times New Roman" w:eastAsia="Times New Roman" w:hAnsi="Times New Roman" w:cs="Times New Roman"/>
           <w:color w:val="262626"/>
           <w:kern w:val="0"/>
           <w:sz w:val="21"/>
@@ -192,7 +262,7 @@
         <w:shd w:val="clear" w:color="auto" w:fill="FFFFFF"/>
         <w:spacing w:after="0" w:line="240" w:lineRule="auto"/>
         <w:rPr>
-          <w:rFonts w:ascii="Open Sans" w:eastAsia="Times New Roman" w:hAnsi="Open Sans" w:cs="Open Sans"/>
+          <w:rFonts w:ascii="Times New Roman" w:eastAsia="Times New Roman" w:hAnsi="Times New Roman" w:cs="Times New Roman"/>
           <w:color w:val="262626"/>
           <w:kern w:val="0"/>
           <w:sz w:val="21"/>
@@ -202,7 +272,7 @@
       </w:pPr>
       <w:r>
         <w:rPr>
-          <w:rFonts w:ascii="Open Sans" w:eastAsia="Times New Roman" w:hAnsi="Open Sans" w:cs="Open Sans"/>
+          <w:rFonts w:ascii="Times New Roman" w:eastAsia="Times New Roman" w:hAnsi="Times New Roman" w:cs="Times New Roman"/>
           <w:color w:val="262626"/>
           <w:kern w:val="0"/>
           <w:sz w:val="21"/>
@@ -221,7 +291,7 @@
         <w:shd w:val="clear" w:color="auto" w:fill="FFFFFF"/>
         <w:spacing w:after="0" w:line="240" w:lineRule="auto"/>
         <w:rPr>
-          <w:rFonts w:ascii="Open Sans" w:eastAsia="Times New Roman" w:hAnsi="Open Sans" w:cs="Open Sans"/>
+          <w:rFonts w:ascii="Times New Roman" w:eastAsia="Times New Roman" w:hAnsi="Times New Roman" w:cs="Times New Roman"/>
           <w:color w:val="262626"/>
           <w:kern w:val="0"/>
           <w:sz w:val="21"/>
@@ -231,7 +301,7 @@
       </w:pPr>
       <w:r>
         <w:rPr>
-          <w:rFonts w:ascii="Open Sans" w:eastAsia="Times New Roman" w:hAnsi="Open Sans" w:cs="Open Sans"/>
+          <w:rFonts w:ascii="Times New Roman" w:eastAsia="Times New Roman" w:hAnsi="Times New Roman" w:cs="Times New Roman"/>
           <w:color w:val="262626"/>
           <w:kern w:val="0"/>
           <w:sz w:val="21"/>
@@ -250,7 +320,7 @@
         <w:shd w:val="clear" w:color="auto" w:fill="FFFFFF"/>
         <w:spacing w:after="0" w:line="240" w:lineRule="auto"/>
         <w:rPr>
-          <w:rFonts w:ascii="Open Sans" w:eastAsia="Times New Roman" w:hAnsi="Open Sans" w:cs="Open Sans"/>
+          <w:rFonts w:ascii="Times New Roman" w:eastAsia="Times New Roman" w:hAnsi="Times New Roman" w:cs="Times New Roman"/>
           <w:color w:val="262626"/>
           <w:kern w:val="0"/>
           <w:sz w:val="21"/>
@@ -260,7 +330,7 @@
       </w:pPr>
       <w:r>
         <w:rPr>
-          <w:rFonts w:ascii="Open Sans" w:eastAsia="Times New Roman" w:hAnsi="Open Sans" w:cs="Open Sans"/>
+          <w:rFonts w:ascii="Times New Roman" w:eastAsia="Times New Roman" w:hAnsi="Times New Roman" w:cs="Times New Roman"/>
           <w:color w:val="262626"/>
           <w:kern w:val="0"/>
           <w:sz w:val="21"/>
@@ -279,7 +349,7 @@
         <w:shd w:val="clear" w:color="auto" w:fill="FFFFFF"/>
         <w:spacing w:after="0" w:line="240" w:lineRule="auto"/>
         <w:rPr>
-          <w:rFonts w:ascii="Open Sans" w:eastAsia="Times New Roman" w:hAnsi="Open Sans" w:cs="Open Sans"/>
+          <w:rFonts w:ascii="Times New Roman" w:eastAsia="Times New Roman" w:hAnsi="Times New Roman" w:cs="Times New Roman"/>
           <w:color w:val="262626"/>
           <w:kern w:val="0"/>
           <w:sz w:val="21"/>
@@ -289,7 +359,7 @@
       </w:pPr>
       <w:r>
         <w:rPr>
-          <w:rFonts w:ascii="Open Sans" w:eastAsia="Times New Roman" w:hAnsi="Open Sans" w:cs="Open Sans"/>
+          <w:rFonts w:ascii="Times New Roman" w:eastAsia="Times New Roman" w:hAnsi="Times New Roman" w:cs="Times New Roman"/>
           <w:color w:val="262626"/>
           <w:kern w:val="0"/>
           <w:sz w:val="21"/>
@@ -308,7 +378,7 @@
         <w:shd w:val="clear" w:color="auto" w:fill="FFFFFF"/>
         <w:spacing w:after="0" w:line="240" w:lineRule="auto"/>
         <w:rPr>
-          <w:rFonts w:ascii="Open Sans" w:eastAsia="Times New Roman" w:hAnsi="Open Sans" w:cs="Open Sans"/>
+          <w:rFonts w:ascii="Times New Roman" w:eastAsia="Times New Roman" w:hAnsi="Times New Roman" w:cs="Times New Roman"/>
           <w:color w:val="262626"/>
           <w:kern w:val="0"/>
           <w:sz w:val="21"/>
@@ -318,7 +388,7 @@
       </w:pPr>
       <w:r>
         <w:rPr>
-          <w:rFonts w:ascii="Open Sans" w:eastAsia="Times New Roman" w:hAnsi="Open Sans" w:cs="Open Sans"/>
+          <w:rFonts w:ascii="Times New Roman" w:eastAsia="Times New Roman" w:hAnsi="Times New Roman" w:cs="Times New Roman"/>
           <w:color w:val="262626"/>
           <w:kern w:val="0"/>
           <w:sz w:val="21"/>
@@ -338,7 +408,7 @@
         <w:shd w:val="clear" w:color="auto" w:fill="FFFFFF"/>
         <w:spacing w:after="0" w:line="240" w:lineRule="auto"/>
         <w:rPr>
-          <w:rFonts w:ascii="Open Sans" w:eastAsia="Times New Roman" w:hAnsi="Open Sans" w:cs="Open Sans"/>
+          <w:rFonts w:ascii="Times New Roman" w:eastAsia="Times New Roman" w:hAnsi="Times New Roman" w:cs="Times New Roman"/>
           <w:color w:val="262626"/>
           <w:kern w:val="0"/>
           <w:sz w:val="21"/>
@@ -348,7 +418,7 @@
       </w:pPr>
       <w:r>
         <w:rPr>
-          <w:rFonts w:ascii="Open Sans" w:eastAsia="Times New Roman" w:hAnsi="Open Sans" w:cs="Open Sans"/>
+          <w:rFonts w:ascii="Times New Roman" w:eastAsia="Times New Roman" w:hAnsi="Times New Roman" w:cs="Times New Roman"/>
           <w:color w:val="262626"/>
           <w:kern w:val="0"/>
           <w:sz w:val="21"/>
@@ -360,7 +430,7 @@
       <w:proofErr w:type="gramStart"/>
       <w:r>
         <w:rPr>
-          <w:rFonts w:ascii="Open Sans" w:eastAsia="Times New Roman" w:hAnsi="Open Sans" w:cs="Open Sans"/>
+          <w:rFonts w:ascii="Times New Roman" w:eastAsia="Times New Roman" w:hAnsi="Times New Roman" w:cs="Times New Roman"/>
           <w:color w:val="262626"/>
           <w:kern w:val="0"/>
           <w:sz w:val="21"/>
@@ -372,7 +442,7 @@
       <w:proofErr w:type="gramEnd"/>
       <w:r>
         <w:rPr>
-          <w:rFonts w:ascii="Open Sans" w:eastAsia="Times New Roman" w:hAnsi="Open Sans" w:cs="Open Sans"/>
+          <w:rFonts w:ascii="Times New Roman" w:eastAsia="Times New Roman" w:hAnsi="Times New Roman" w:cs="Times New Roman"/>
           <w:color w:val="262626"/>
           <w:kern w:val="0"/>
           <w:sz w:val="21"/>
@@ -387,7 +457,7 @@
         <w:shd w:val="clear" w:color="auto" w:fill="FFFFFF"/>
         <w:spacing w:after="0" w:line="240" w:lineRule="auto"/>
         <w:rPr>
-          <w:rFonts w:ascii="Open Sans" w:eastAsia="Times New Roman" w:hAnsi="Open Sans" w:cs="Open Sans"/>
+          <w:rFonts w:ascii="Times New Roman" w:eastAsia="Times New Roman" w:hAnsi="Times New Roman" w:cs="Times New Roman"/>
           <w:color w:val="262626"/>
           <w:kern w:val="0"/>
           <w:sz w:val="21"/>
@@ -397,62 +467,733 @@
       </w:pPr>
     </w:p>
     <w:p>
-      <w:r>
+      <w:pPr>
+        <w:rPr>
+          <w:rFonts w:ascii="Times New Roman" w:hAnsi="Times New Roman" w:cs="Times New Roman"/>
+        </w:rPr>
+      </w:pPr>
+      <w:r>
+        <w:rPr>
+          <w:rFonts w:ascii="Times New Roman" w:hAnsi="Times New Roman" w:cs="Times New Roman"/>
+        </w:rPr>
         <w:t xml:space="preserve">Submission: </w:t>
       </w:r>
-      <w:proofErr w:type="gramStart"/>
-      <w:r>
-        <w:t>Three page</w:t>
-      </w:r>
-      <w:proofErr w:type="gramEnd"/>
-      <w:r>
+      <w:r>
+        <w:rPr>
+          <w:rFonts w:ascii="Times New Roman" w:hAnsi="Times New Roman" w:cs="Times New Roman"/>
+        </w:rPr>
+        <w:t>Three-page</w:t>
+      </w:r>
+      <w:r>
+        <w:rPr>
+          <w:rFonts w:ascii="Times New Roman" w:hAnsi="Times New Roman" w:cs="Times New Roman"/>
+        </w:rPr>
         <w:t xml:space="preserve"> writeup</w:t>
       </w:r>
       <w:r>
+        <w:rPr>
+          <w:rFonts w:ascii="Times New Roman" w:hAnsi="Times New Roman" w:cs="Times New Roman"/>
+        </w:rPr>
         <w:t xml:space="preserve">. Submit to blackboard and to groups </w:t>
       </w:r>
       <w:r>
+        <w:rPr>
+          <w:rFonts w:ascii="Times New Roman" w:hAnsi="Times New Roman" w:cs="Times New Roman"/>
+        </w:rPr>
         <w:t>for peer review.</w:t>
       </w:r>
     </w:p>
-    <w:p/>
-    <w:p>
-      <w:r>
+    <w:p>
+      <w:pPr>
+        <w:rPr>
+          <w:rFonts w:ascii="Times New Roman" w:hAnsi="Times New Roman" w:cs="Times New Roman"/>
+          <w:sz w:val="28"/>
+          <w:szCs w:val="28"/>
+          <w:u w:val="single"/>
+        </w:rPr>
+      </w:pPr>
+      <w:r>
+        <w:rPr>
+          <w:rFonts w:ascii="Times New Roman" w:hAnsi="Times New Roman" w:cs="Times New Roman"/>
+          <w:sz w:val="28"/>
+          <w:szCs w:val="28"/>
+          <w:u w:val="single"/>
+        </w:rPr>
         <w:t>Week 3: Milestone 2 Group Evaluation or Peer Review</w:t>
       </w:r>
     </w:p>
-    <w:p/>
-    <w:p>
-      <w:r>
+    <w:p>
+      <w:pPr>
+        <w:rPr>
+          <w:rFonts w:ascii="Times New Roman" w:hAnsi="Times New Roman" w:cs="Times New Roman"/>
+          <w:sz w:val="21"/>
+          <w:szCs w:val="21"/>
+        </w:rPr>
+      </w:pPr>
+      <w:r>
+        <w:rPr>
+          <w:rFonts w:ascii="Times New Roman" w:hAnsi="Times New Roman" w:cs="Times New Roman"/>
+          <w:sz w:val="21"/>
+          <w:szCs w:val="21"/>
+        </w:rPr>
+        <w:t>Write up a review of another project.</w:t>
+      </w:r>
+      <w:r>
+        <w:rPr>
+          <w:rFonts w:ascii="Times New Roman" w:hAnsi="Times New Roman" w:cs="Times New Roman"/>
+          <w:sz w:val="21"/>
+          <w:szCs w:val="21"/>
+        </w:rPr>
+        <w:t xml:space="preserve"> I have chosen Nicholas Rodriguez’s project as the one I’ll be reviewing.</w:t>
+      </w:r>
+    </w:p>
+    <w:p>
+      <w:pPr>
+        <w:rPr>
+          <w:rFonts w:ascii="Times New Roman" w:hAnsi="Times New Roman" w:cs="Times New Roman"/>
+          <w:sz w:val="28"/>
+          <w:szCs w:val="28"/>
+          <w:u w:val="single"/>
+        </w:rPr>
+      </w:pPr>
+      <w:r>
+        <w:rPr>
+          <w:rFonts w:ascii="Times New Roman" w:hAnsi="Times New Roman" w:cs="Times New Roman"/>
+          <w:sz w:val="28"/>
+          <w:szCs w:val="28"/>
+          <w:u w:val="single"/>
+        </w:rPr>
+        <w:t xml:space="preserve">Week </w:t>
+      </w:r>
+      <w:r>
+        <w:rPr>
+          <w:rFonts w:ascii="Times New Roman" w:hAnsi="Times New Roman" w:cs="Times New Roman"/>
+          <w:sz w:val="28"/>
+          <w:szCs w:val="28"/>
+          <w:u w:val="single"/>
+        </w:rPr>
+        <w:t>4-5</w:t>
+      </w:r>
+      <w:r>
+        <w:rPr>
+          <w:rFonts w:ascii="Times New Roman" w:hAnsi="Times New Roman" w:cs="Times New Roman"/>
+          <w:sz w:val="28"/>
+          <w:szCs w:val="28"/>
+          <w:u w:val="single"/>
+        </w:rPr>
+        <w:t xml:space="preserve">: </w:t>
+      </w:r>
+      <w:r>
+        <w:rPr>
+          <w:rFonts w:ascii="Times New Roman" w:hAnsi="Times New Roman" w:cs="Times New Roman"/>
+          <w:sz w:val="28"/>
+          <w:szCs w:val="28"/>
+          <w:u w:val="single"/>
+        </w:rPr>
+        <w:t>Begin Milestone 3</w:t>
+      </w:r>
+      <w:r>
+        <w:rPr>
+          <w:rFonts w:ascii="Times New Roman" w:hAnsi="Times New Roman" w:cs="Times New Roman"/>
+          <w:sz w:val="28"/>
+          <w:szCs w:val="28"/>
+          <w:u w:val="single"/>
+        </w:rPr>
+        <w:t>, but work won’t be submitted until week 6!</w:t>
+      </w:r>
+    </w:p>
+    <w:p>
+      <w:pPr>
+        <w:rPr>
+          <w:rFonts w:ascii="Times New Roman" w:hAnsi="Times New Roman" w:cs="Times New Roman"/>
+          <w:sz w:val="21"/>
+          <w:szCs w:val="21"/>
+        </w:rPr>
+      </w:pPr>
+      <w:r>
+        <w:rPr>
+          <w:rFonts w:ascii="Times New Roman" w:hAnsi="Times New Roman" w:cs="Times New Roman"/>
+          <w:sz w:val="21"/>
+          <w:szCs w:val="21"/>
+        </w:rPr>
+        <w:t xml:space="preserve">This will be the most important time for setting the path </w:t>
+      </w:r>
+      <w:r>
+        <w:rPr>
+          <w:rFonts w:ascii="Times New Roman" w:hAnsi="Times New Roman" w:cs="Times New Roman"/>
+          <w:sz w:val="21"/>
+          <w:szCs w:val="21"/>
+        </w:rPr>
+        <w:t>of the project. I will also seek out other data sources to supplement the project.</w:t>
+      </w:r>
+    </w:p>
+    <w:p>
+      <w:pPr>
+        <w:rPr>
+          <w:rFonts w:ascii="Times New Roman" w:hAnsi="Times New Roman" w:cs="Times New Roman"/>
+          <w:sz w:val="28"/>
+          <w:szCs w:val="28"/>
+          <w:u w:val="single"/>
+        </w:rPr>
+      </w:pPr>
+      <w:r>
+        <w:rPr>
+          <w:rFonts w:ascii="Times New Roman" w:hAnsi="Times New Roman" w:cs="Times New Roman"/>
+          <w:sz w:val="28"/>
+          <w:szCs w:val="28"/>
+          <w:u w:val="single"/>
+        </w:rPr>
         <w:t>Week 6: Milestone 3 Due (Preliminary Analysis)</w:t>
       </w:r>
     </w:p>
-    <w:p/>
-    <w:p>
-      <w:r>
+    <w:p>
+      <w:pPr>
+        <w:rPr>
+          <w:rFonts w:ascii="Times New Roman" w:hAnsi="Times New Roman" w:cs="Times New Roman"/>
+        </w:rPr>
+      </w:pPr>
+      <w:r>
+        <w:rPr>
+          <w:rFonts w:ascii="Times New Roman" w:hAnsi="Times New Roman" w:cs="Times New Roman"/>
+        </w:rPr>
+        <w:t>Update Milestone 2 and answer these questions:</w:t>
+      </w:r>
+    </w:p>
+    <w:p>
+      <w:pPr>
+        <w:pStyle w:val="ListParagraph"/>
+        <w:numPr>
+          <w:ilvl w:val="0"/>
+          <w:numId w:val="5"/>
+        </w:numPr>
+        <w:rPr>
+          <w:rFonts w:ascii="Times New Roman" w:hAnsi="Times New Roman" w:cs="Times New Roman"/>
+        </w:rPr>
+      </w:pPr>
+      <w:r>
+        <w:rPr>
+          <w:rFonts w:ascii="Times New Roman" w:hAnsi="Times New Roman" w:cs="Times New Roman"/>
+        </w:rPr>
+        <w:t>Will I be able to answer the questions I want to answer with the data I have?</w:t>
+      </w:r>
+    </w:p>
+    <w:p>
+      <w:pPr>
+        <w:pStyle w:val="ListParagraph"/>
+        <w:numPr>
+          <w:ilvl w:val="0"/>
+          <w:numId w:val="5"/>
+        </w:numPr>
+        <w:rPr>
+          <w:rFonts w:ascii="Times New Roman" w:hAnsi="Times New Roman" w:cs="Times New Roman"/>
+        </w:rPr>
+      </w:pPr>
+      <w:r>
+        <w:rPr>
+          <w:rFonts w:ascii="Times New Roman" w:hAnsi="Times New Roman" w:cs="Times New Roman"/>
+        </w:rPr>
+        <w:lastRenderedPageBreak/>
+        <w:t>What visualizations are especially useful for explaining my data?</w:t>
+      </w:r>
+    </w:p>
+    <w:p>
+      <w:pPr>
+        <w:pStyle w:val="ListParagraph"/>
+        <w:numPr>
+          <w:ilvl w:val="0"/>
+          <w:numId w:val="5"/>
+        </w:numPr>
+        <w:rPr>
+          <w:rFonts w:ascii="Times New Roman" w:hAnsi="Times New Roman" w:cs="Times New Roman"/>
+        </w:rPr>
+      </w:pPr>
+      <w:r>
+        <w:rPr>
+          <w:rFonts w:ascii="Times New Roman" w:hAnsi="Times New Roman" w:cs="Times New Roman"/>
+        </w:rPr>
+        <w:t>Do I need to adjust the data and/or driving questions?</w:t>
+      </w:r>
+    </w:p>
+    <w:p>
+      <w:pPr>
+        <w:pStyle w:val="ListParagraph"/>
+        <w:numPr>
+          <w:ilvl w:val="0"/>
+          <w:numId w:val="5"/>
+        </w:numPr>
+        <w:rPr>
+          <w:rFonts w:ascii="Times New Roman" w:hAnsi="Times New Roman" w:cs="Times New Roman"/>
+        </w:rPr>
+      </w:pPr>
+      <w:r>
+        <w:rPr>
+          <w:rFonts w:ascii="Times New Roman" w:hAnsi="Times New Roman" w:cs="Times New Roman"/>
+        </w:rPr>
+        <w:t>Do I need to adjust my model/evaluation choices?</w:t>
+      </w:r>
+    </w:p>
+    <w:p>
+      <w:pPr>
+        <w:pStyle w:val="ListParagraph"/>
+        <w:numPr>
+          <w:ilvl w:val="0"/>
+          <w:numId w:val="5"/>
+        </w:numPr>
+        <w:rPr>
+          <w:rFonts w:ascii="Times New Roman" w:hAnsi="Times New Roman" w:cs="Times New Roman"/>
+        </w:rPr>
+      </w:pPr>
+      <w:r>
+        <w:rPr>
+          <w:rFonts w:ascii="Times New Roman" w:hAnsi="Times New Roman" w:cs="Times New Roman"/>
+        </w:rPr>
+        <w:t>Are my original expectations still reasonable?</w:t>
+      </w:r>
+    </w:p>
+    <w:p>
+      <w:pPr>
+        <w:rPr>
+          <w:rFonts w:ascii="Times New Roman" w:hAnsi="Times New Roman" w:cs="Times New Roman"/>
+          <w:sz w:val="28"/>
+          <w:szCs w:val="28"/>
+          <w:u w:val="single"/>
+        </w:rPr>
+      </w:pPr>
+      <w:r>
+        <w:rPr>
+          <w:rFonts w:ascii="Times New Roman" w:hAnsi="Times New Roman" w:cs="Times New Roman"/>
+          <w:sz w:val="28"/>
+          <w:szCs w:val="28"/>
+          <w:u w:val="single"/>
+        </w:rPr>
         <w:t>Week 7: Milestone 3 Group Evaluation or Peer Review</w:t>
       </w:r>
     </w:p>
-    <w:p/>
-    <w:p>
-      <w:r>
+    <w:p>
+      <w:pPr>
+        <w:rPr>
+          <w:rFonts w:ascii="Times New Roman" w:hAnsi="Times New Roman" w:cs="Times New Roman"/>
+          <w:sz w:val="28"/>
+          <w:szCs w:val="28"/>
+        </w:rPr>
+      </w:pPr>
+      <w:r>
+        <w:rPr>
+          <w:rFonts w:ascii="Times New Roman" w:hAnsi="Times New Roman" w:cs="Times New Roman"/>
+          <w:sz w:val="28"/>
+          <w:szCs w:val="28"/>
+        </w:rPr>
+        <w:t>Update Milestone 3 with this information</w:t>
+      </w:r>
+    </w:p>
+    <w:p>
+      <w:pPr>
+        <w:pStyle w:val="ListParagraph"/>
+        <w:numPr>
+          <w:ilvl w:val="0"/>
+          <w:numId w:val="6"/>
+        </w:numPr>
+        <w:shd w:val="clear" w:color="auto" w:fill="FFFFFF"/>
+        <w:spacing w:after="0" w:line="240" w:lineRule="auto"/>
+        <w:rPr>
+          <w:rFonts w:ascii="Times New Roman" w:eastAsia="Times New Roman" w:hAnsi="Times New Roman" w:cs="Times New Roman"/>
+          <w:color w:val="262626"/>
+          <w:kern w:val="0"/>
+          <w:sz w:val="21"/>
+          <w:szCs w:val="21"/>
+          <w14:ligatures w14:val="none"/>
+        </w:rPr>
+      </w:pPr>
+      <w:r>
+        <w:rPr>
+          <w:rFonts w:ascii="Times New Roman" w:eastAsia="Times New Roman" w:hAnsi="Times New Roman" w:cs="Times New Roman"/>
+          <w:color w:val="262626"/>
+          <w:kern w:val="0"/>
+          <w:sz w:val="21"/>
+          <w:szCs w:val="21"/>
+          <w14:ligatures w14:val="none"/>
+        </w:rPr>
+        <w:t>Explain your process for prepping the data</w:t>
+      </w:r>
+    </w:p>
+    <w:p>
+      <w:pPr>
+        <w:numPr>
+          <w:ilvl w:val="0"/>
+          <w:numId w:val="6"/>
+        </w:numPr>
+        <w:shd w:val="clear" w:color="auto" w:fill="FFFFFF"/>
+        <w:spacing w:after="0" w:line="240" w:lineRule="auto"/>
+        <w:rPr>
+          <w:rFonts w:ascii="Times New Roman" w:eastAsia="Times New Roman" w:hAnsi="Times New Roman" w:cs="Times New Roman"/>
+          <w:color w:val="262626"/>
+          <w:kern w:val="0"/>
+          <w:sz w:val="21"/>
+          <w:szCs w:val="21"/>
+          <w14:ligatures w14:val="none"/>
+        </w:rPr>
+      </w:pPr>
+      <w:r>
+        <w:rPr>
+          <w:rFonts w:ascii="Times New Roman" w:eastAsia="Times New Roman" w:hAnsi="Times New Roman" w:cs="Times New Roman"/>
+          <w:color w:val="262626"/>
+          <w:kern w:val="0"/>
+          <w:sz w:val="21"/>
+          <w:szCs w:val="21"/>
+          <w14:ligatures w14:val="none"/>
+        </w:rPr>
+        <w:t>Build and evaluate at least one model</w:t>
+      </w:r>
+    </w:p>
+    <w:p>
+      <w:pPr>
+        <w:numPr>
+          <w:ilvl w:val="0"/>
+          <w:numId w:val="6"/>
+        </w:numPr>
+        <w:shd w:val="clear" w:color="auto" w:fill="FFFFFF"/>
+        <w:spacing w:after="0" w:line="240" w:lineRule="auto"/>
+        <w:rPr>
+          <w:rFonts w:ascii="Times New Roman" w:eastAsia="Times New Roman" w:hAnsi="Times New Roman" w:cs="Times New Roman"/>
+          <w:color w:val="262626"/>
+          <w:kern w:val="0"/>
+          <w:sz w:val="21"/>
+          <w:szCs w:val="21"/>
+          <w14:ligatures w14:val="none"/>
+        </w:rPr>
+      </w:pPr>
+      <w:r>
+        <w:rPr>
+          <w:rFonts w:ascii="Times New Roman" w:eastAsia="Times New Roman" w:hAnsi="Times New Roman" w:cs="Times New Roman"/>
+          <w:color w:val="262626"/>
+          <w:kern w:val="0"/>
+          <w:sz w:val="21"/>
+          <w:szCs w:val="21"/>
+          <w14:ligatures w14:val="none"/>
+        </w:rPr>
+        <w:t>Interpret your results</w:t>
+      </w:r>
+    </w:p>
+    <w:p>
+      <w:pPr>
+        <w:numPr>
+          <w:ilvl w:val="0"/>
+          <w:numId w:val="6"/>
+        </w:numPr>
+        <w:shd w:val="clear" w:color="auto" w:fill="FFFFFF"/>
+        <w:spacing w:after="0" w:line="240" w:lineRule="auto"/>
+        <w:rPr>
+          <w:rFonts w:ascii="Times New Roman" w:eastAsia="Times New Roman" w:hAnsi="Times New Roman" w:cs="Times New Roman"/>
+          <w:color w:val="262626"/>
+          <w:kern w:val="0"/>
+          <w:sz w:val="21"/>
+          <w:szCs w:val="21"/>
+          <w14:ligatures w14:val="none"/>
+        </w:rPr>
+      </w:pPr>
+      <w:r>
+        <w:rPr>
+          <w:rFonts w:ascii="Times New Roman" w:eastAsia="Times New Roman" w:hAnsi="Times New Roman" w:cs="Times New Roman"/>
+          <w:color w:val="262626"/>
+          <w:kern w:val="0"/>
+          <w:sz w:val="21"/>
+          <w:szCs w:val="21"/>
+          <w14:ligatures w14:val="none"/>
+        </w:rPr>
+        <w:t>Begin to formulate a conclusion/recommendations</w:t>
+      </w:r>
+    </w:p>
+    <w:p>
+      <w:pPr>
+        <w:numPr>
+          <w:ilvl w:val="0"/>
+          <w:numId w:val="6"/>
+        </w:numPr>
+        <w:shd w:val="clear" w:color="auto" w:fill="FFFFFF"/>
+        <w:spacing w:after="0" w:line="240" w:lineRule="auto"/>
+        <w:rPr>
+          <w:rFonts w:ascii="Times New Roman" w:eastAsia="Times New Roman" w:hAnsi="Times New Roman" w:cs="Times New Roman"/>
+          <w:color w:val="262626"/>
+          <w:kern w:val="0"/>
+          <w:sz w:val="21"/>
+          <w:szCs w:val="21"/>
+          <w14:ligatures w14:val="none"/>
+        </w:rPr>
+      </w:pPr>
+      <w:r>
+        <w:rPr>
+          <w:rFonts w:ascii="Times New Roman" w:eastAsia="Times New Roman" w:hAnsi="Times New Roman" w:cs="Times New Roman"/>
+          <w:color w:val="262626"/>
+          <w:kern w:val="0"/>
+          <w:sz w:val="21"/>
+          <w:szCs w:val="21"/>
+          <w14:ligatures w14:val="none"/>
+        </w:rPr>
+        <w:t>Analyze the ethical implications of the project</w:t>
+      </w:r>
+    </w:p>
+    <w:p>
+      <w:pPr>
+        <w:shd w:val="clear" w:color="auto" w:fill="FFFFFF"/>
+        <w:spacing w:after="0" w:line="240" w:lineRule="auto"/>
+        <w:ind w:left="720"/>
+        <w:rPr>
+          <w:rFonts w:ascii="Times New Roman" w:eastAsia="Times New Roman" w:hAnsi="Times New Roman" w:cs="Times New Roman"/>
+          <w:color w:val="262626"/>
+          <w:kern w:val="0"/>
+          <w:sz w:val="21"/>
+          <w:szCs w:val="21"/>
+          <w14:ligatures w14:val="none"/>
+        </w:rPr>
+      </w:pPr>
+    </w:p>
+    <w:p>
+      <w:pPr>
+        <w:shd w:val="clear" w:color="auto" w:fill="FFFFFF"/>
+        <w:spacing w:after="0" w:line="240" w:lineRule="auto"/>
+        <w:rPr>
+          <w:rFonts w:ascii="Times New Roman" w:eastAsia="Times New Roman" w:hAnsi="Times New Roman" w:cs="Times New Roman"/>
+          <w:color w:val="262626"/>
+          <w:kern w:val="0"/>
+          <w:sz w:val="21"/>
+          <w:szCs w:val="21"/>
+          <w14:ligatures w14:val="none"/>
+        </w:rPr>
+      </w:pPr>
+      <w:r>
+        <w:rPr>
+          <w:rFonts w:ascii="Times New Roman" w:eastAsia="Times New Roman" w:hAnsi="Times New Roman" w:cs="Times New Roman"/>
+          <w:color w:val="262626"/>
+          <w:kern w:val="0"/>
+          <w:sz w:val="21"/>
+          <w:szCs w:val="21"/>
+          <w14:ligatures w14:val="none"/>
+        </w:rPr>
+        <w:t>Submission: Milestone 4 to group submission and Blackboard</w:t>
+      </w:r>
+    </w:p>
+    <w:p>
+      <w:pPr>
+        <w:shd w:val="clear" w:color="auto" w:fill="FFFFFF"/>
+        <w:spacing w:after="0" w:line="240" w:lineRule="auto"/>
+        <w:rPr>
+          <w:rFonts w:ascii="Times New Roman" w:eastAsia="Times New Roman" w:hAnsi="Times New Roman" w:cs="Times New Roman"/>
+          <w:color w:val="262626"/>
+          <w:kern w:val="0"/>
+          <w:sz w:val="21"/>
+          <w:szCs w:val="21"/>
+          <w14:ligatures w14:val="none"/>
+        </w:rPr>
+      </w:pPr>
+    </w:p>
+    <w:p>
+      <w:pPr>
+        <w:rPr>
+          <w:rFonts w:ascii="Times New Roman" w:hAnsi="Times New Roman" w:cs="Times New Roman"/>
+          <w:sz w:val="28"/>
+          <w:szCs w:val="28"/>
+          <w:u w:val="single"/>
+        </w:rPr>
+      </w:pPr>
+      <w:r>
+        <w:rPr>
+          <w:rFonts w:ascii="Times New Roman" w:hAnsi="Times New Roman" w:cs="Times New Roman"/>
+          <w:sz w:val="28"/>
+          <w:szCs w:val="28"/>
+          <w:u w:val="single"/>
+        </w:rPr>
         <w:t>Week 9: Milestone 4 Due (Finalizing Your Results)</w:t>
       </w:r>
     </w:p>
-    <w:p/>
-    <w:p>
-      <w:r>
+    <w:p>
+      <w:pPr>
+        <w:pStyle w:val="ListParagraph"/>
+        <w:numPr>
+          <w:ilvl w:val="0"/>
+          <w:numId w:val="9"/>
+        </w:numPr>
+        <w:rPr>
+          <w:rFonts w:ascii="Times New Roman" w:hAnsi="Times New Roman" w:cs="Times New Roman"/>
+          <w:sz w:val="21"/>
+          <w:szCs w:val="21"/>
+        </w:rPr>
+      </w:pPr>
+      <w:r>
+        <w:rPr>
+          <w:rFonts w:ascii="Times New Roman" w:hAnsi="Times New Roman" w:cs="Times New Roman"/>
+          <w:sz w:val="21"/>
+          <w:szCs w:val="21"/>
+        </w:rPr>
+        <w:t>Review the original problem and ensure it was solved with our modeling. Polish up the papers/code along with spell check/grammar.</w:t>
+      </w:r>
+    </w:p>
+    <w:p>
+      <w:pPr>
+        <w:rPr>
+          <w:rFonts w:ascii="Times New Roman" w:hAnsi="Times New Roman" w:cs="Times New Roman"/>
+          <w:sz w:val="28"/>
+          <w:szCs w:val="28"/>
+          <w:u w:val="single"/>
+        </w:rPr>
+      </w:pPr>
+      <w:r>
+        <w:rPr>
+          <w:rFonts w:ascii="Times New Roman" w:hAnsi="Times New Roman" w:cs="Times New Roman"/>
+          <w:sz w:val="28"/>
+          <w:szCs w:val="28"/>
+          <w:u w:val="single"/>
+        </w:rPr>
         <w:t>Week 10: Milestone 4 Group Evaluation or Peer Review</w:t>
       </w:r>
     </w:p>
-    <w:p/>
-    <w:p>
-      <w:r>
+    <w:p>
+      <w:pPr>
+        <w:pStyle w:val="ListParagraph"/>
+        <w:numPr>
+          <w:ilvl w:val="0"/>
+          <w:numId w:val="8"/>
+        </w:numPr>
+        <w:rPr>
+          <w:rFonts w:ascii="Times New Roman" w:hAnsi="Times New Roman" w:cs="Times New Roman"/>
+          <w:sz w:val="21"/>
+          <w:szCs w:val="21"/>
+        </w:rPr>
+      </w:pPr>
+      <w:r>
+        <w:rPr>
+          <w:rFonts w:ascii="Times New Roman" w:hAnsi="Times New Roman" w:cs="Times New Roman"/>
+          <w:sz w:val="21"/>
+          <w:szCs w:val="21"/>
+        </w:rPr>
+        <w:t>Conduct peer reviews. I’ve chosen Nicholas Rodriguez for a peer review. I’ll complete the form, critique the project for constructive feedback, and adjust based on my own feedback.</w:t>
+      </w:r>
+    </w:p>
+    <w:p>
+      <w:pPr>
+        <w:rPr>
+          <w:rFonts w:ascii="Times New Roman" w:hAnsi="Times New Roman" w:cs="Times New Roman"/>
+          <w:sz w:val="28"/>
+          <w:szCs w:val="28"/>
+          <w:u w:val="single"/>
+        </w:rPr>
+      </w:pPr>
+      <w:r>
+        <w:rPr>
+          <w:rFonts w:ascii="Times New Roman" w:hAnsi="Times New Roman" w:cs="Times New Roman"/>
+          <w:sz w:val="28"/>
+          <w:szCs w:val="28"/>
+          <w:u w:val="single"/>
+        </w:rPr>
         <w:t>Week 11: Milestone 5: Final Project Submission (Final Paper and Presentation – Due Sunday!)</w:t>
       </w:r>
     </w:p>
+    <w:p>
+      <w:pPr>
+        <w:pStyle w:val="ListParagraph"/>
+        <w:numPr>
+          <w:ilvl w:val="0"/>
+          <w:numId w:val="7"/>
+        </w:numPr>
+        <w:rPr>
+          <w:rFonts w:ascii="Times New Roman" w:hAnsi="Times New Roman" w:cs="Times New Roman"/>
+          <w:sz w:val="21"/>
+          <w:szCs w:val="21"/>
+        </w:rPr>
+      </w:pPr>
+      <w:r>
+        <w:rPr>
+          <w:rFonts w:ascii="Times New Roman" w:hAnsi="Times New Roman" w:cs="Times New Roman"/>
+          <w:sz w:val="21"/>
+          <w:szCs w:val="21"/>
+        </w:rPr>
+        <w:t>Paper (less than 50 pages)</w:t>
+      </w:r>
+    </w:p>
+    <w:p>
+      <w:pPr>
+        <w:pStyle w:val="ListParagraph"/>
+        <w:numPr>
+          <w:ilvl w:val="0"/>
+          <w:numId w:val="7"/>
+        </w:numPr>
+        <w:rPr>
+          <w:rFonts w:ascii="Times New Roman" w:hAnsi="Times New Roman" w:cs="Times New Roman"/>
+          <w:sz w:val="21"/>
+          <w:szCs w:val="21"/>
+        </w:rPr>
+      </w:pPr>
+      <w:r>
+        <w:rPr>
+          <w:rFonts w:ascii="Times New Roman" w:hAnsi="Times New Roman" w:cs="Times New Roman"/>
+          <w:sz w:val="21"/>
+          <w:szCs w:val="21"/>
+        </w:rPr>
+        <w:t xml:space="preserve">PowerPoint Presentation </w:t>
+      </w:r>
+      <w:r>
+        <w:rPr>
+          <w:rFonts w:ascii="Times New Roman" w:hAnsi="Times New Roman" w:cs="Times New Roman"/>
+          <w:sz w:val="21"/>
+          <w:szCs w:val="21"/>
+        </w:rPr>
+        <w:t>(10-20 slides WITH visualizations/key points)</w:t>
+      </w:r>
+    </w:p>
+    <w:p>
+      <w:pPr>
+        <w:pStyle w:val="ListParagraph"/>
+        <w:numPr>
+          <w:ilvl w:val="0"/>
+          <w:numId w:val="7"/>
+        </w:numPr>
+        <w:rPr>
+          <w:rFonts w:ascii="Times New Roman" w:hAnsi="Times New Roman" w:cs="Times New Roman"/>
+          <w:sz w:val="21"/>
+          <w:szCs w:val="21"/>
+        </w:rPr>
+      </w:pPr>
+      <w:r>
+        <w:rPr>
+          <w:rFonts w:ascii="Times New Roman" w:hAnsi="Times New Roman" w:cs="Times New Roman"/>
+          <w:sz w:val="21"/>
+          <w:szCs w:val="21"/>
+        </w:rPr>
+        <w:t>Recording of Presentation (between 7-15 minutes)</w:t>
+      </w:r>
+    </w:p>
+    <w:p>
+      <w:pPr>
+        <w:pStyle w:val="ListParagraph"/>
+        <w:numPr>
+          <w:ilvl w:val="0"/>
+          <w:numId w:val="7"/>
+        </w:numPr>
+        <w:rPr>
+          <w:rFonts w:ascii="Times New Roman" w:hAnsi="Times New Roman" w:cs="Times New Roman"/>
+          <w:sz w:val="21"/>
+          <w:szCs w:val="21"/>
+        </w:rPr>
+      </w:pPr>
+      <w:r>
+        <w:rPr>
+          <w:rFonts w:ascii="Times New Roman" w:hAnsi="Times New Roman" w:cs="Times New Roman"/>
+          <w:sz w:val="21"/>
+          <w:szCs w:val="21"/>
+        </w:rPr>
+        <w:t>Python/R code (optionally submitted as appendix)</w:t>
+      </w:r>
+    </w:p>
+    <w:p>
+      <w:pPr>
+        <w:rPr>
+          <w:rFonts w:ascii="Times New Roman" w:hAnsi="Times New Roman" w:cs="Times New Roman"/>
+          <w:sz w:val="21"/>
+          <w:szCs w:val="21"/>
+        </w:rPr>
+      </w:pPr>
+    </w:p>
     <w:sectPr>
-      <w:headerReference w:type="default" r:id="rId8"/>
+      <w:headerReference w:type="default" r:id="rId7"/>
       <w:pgSz w:w="12240" w:h="15840"/>
       <w:pgMar w:top="1440" w:right="1440" w:bottom="1440" w:left="1440" w:header="720" w:footer="720" w:gutter="0"/>
       <w:cols w:space="720"/>
@@ -550,7 +1291,10 @@
       <w:pStyle w:val="Header"/>
     </w:pPr>
     <w:r>
-      <w:t>Professor Brett Werner</w:t>
+      <w:t xml:space="preserve">Professor </w:t>
+    </w:r>
+    <w:r>
+      <w:t>Andrew Hua</w:t>
     </w:r>
   </w:p>
   <w:p>
@@ -577,6 +1321,470 @@
 <file path=word/numbering.xml><?xml version="1.0" encoding="utf-8"?>
 <w:numbering xmlns:wpc="http://schemas.microsoft.com/office/word/2010/wordprocessingCanvas" xmlns:cx="http://schemas.microsoft.com/office/drawing/2014/chartex" xmlns:cx1="http://schemas.microsoft.com/office/drawing/2015/9/8/chartex" xmlns:cx2="http://schemas.microsoft.com/office/drawing/2015/10/21/chartex" xmlns:cx3="http://schemas.microsoft.com/office/drawing/2016/5/9/chartex" xmlns:cx4="http://schemas.microsoft.com/office/drawing/2016/5/10/chartex" xmlns:cx5="http://schemas.microsoft.com/office/drawing/2016/5/11/chartex" xmlns:cx6="http://schemas.microsoft.com/office/drawing/2016/5/12/chartex" xmlns:cx7="http://schemas.microsoft.com/office/drawing/2016/5/13/chartex" xmlns:cx8="http://schemas.microsoft.com/office/drawing/2016/5/14/chartex" xmlns:mc="http://schemas.openxmlformats.org/markup-compatibility/2006" xmlns:aink="http://schemas.microsoft.com/office/drawing/2016/ink" xmlns:am3d="http://schemas.microsoft.com/office/drawing/2017/model3d" xmlns:o="urn:schemas-microsoft-com:office:office" xmlns:oel="http://schemas.microsoft.com/office/2019/extlst" xmlns:r="http://schemas.openxmlformats.org/officeDocument/2006/relationships" xmlns:m="http://schemas.openxmlformats.org/officeDocument/2006/math" xmlns:v="urn:schemas-microsoft-com:vml" xmlns:wp14="http://schemas.microsoft.com/office/word/2010/wordprocessingDrawing" xmlns:wp="http://schemas.openxmlformats.org/drawingml/2006/wordprocessingDrawing" xmlns:w10="urn:schemas-microsoft-com:office:word" xmlns:w="http://schemas.openxmlformats.org/wordprocessingml/2006/main" xmlns:w14="http://schemas.microsoft.com/office/word/2010/wordml" xmlns:w15="http://schemas.microsoft.com/office/word/2012/wordml" xmlns:w16cex="http://schemas.microsoft.com/office/word/2018/wordml/cex" xmlns:w16cid="http://schemas.microsoft.com/office/word/2016/wordml/cid" xmlns:w16="http://schemas.microsoft.com/office/word/2018/wordml" xmlns:w16du="http://schemas.microsoft.com/office/word/2023/wordml/word16du" xmlns:w16sdtdh="http://schemas.microsoft.com/office/word/2020/wordml/sdtdatahash" xmlns:w16sdtfl="http://schemas.microsoft.com/office/word/2024/wordml/sdtformatlock" xmlns:w16se="http://schemas.microsoft.com/office/word/2015/wordml/symex" xmlns:wpg="http://schemas.microsoft.com/office/word/2010/wordprocessingGroup" xmlns:wpi="http://schemas.microsoft.com/office/word/2010/wordprocessingInk" xmlns:wne="http://schemas.microsoft.com/office/word/2006/wordml" xmlns:wps="http://schemas.microsoft.com/office/word/2010/wordprocessingShape" mc:Ignorable="w14 w15 w16se w16cid w16 w16cex w16sdtdh w16sdtfl w16du wp14">
   <w:abstractNum w:abstractNumId="0" w15:restartNumberingAfterBreak="0">
+    <w:nsid w:val="13265203"/>
+    <w:multiLevelType w:val="hybridMultilevel"/>
+    <w:tmpl w:val="1ACA1FF8"/>
+    <w:lvl w:ilvl="0" w:tplc="04090001">
+      <w:start w:val="1"/>
+      <w:numFmt w:val="bullet"/>
+      <w:lvlText w:val=""/>
+      <w:lvlJc w:val="left"/>
+      <w:pPr>
+        <w:ind w:left="720" w:hanging="360"/>
+      </w:pPr>
+      <w:rPr>
+        <w:rFonts w:ascii="Symbol" w:hAnsi="Symbol" w:hint="default"/>
+      </w:rPr>
+    </w:lvl>
+    <w:lvl w:ilvl="1" w:tplc="04090003" w:tentative="1">
+      <w:start w:val="1"/>
+      <w:numFmt w:val="bullet"/>
+      <w:lvlText w:val="o"/>
+      <w:lvlJc w:val="left"/>
+      <w:pPr>
+        <w:ind w:left="1440" w:hanging="360"/>
+      </w:pPr>
+      <w:rPr>
+        <w:rFonts w:ascii="Courier New" w:hAnsi="Courier New" w:cs="Courier New" w:hint="default"/>
+      </w:rPr>
+    </w:lvl>
+    <w:lvl w:ilvl="2" w:tplc="04090005" w:tentative="1">
+      <w:start w:val="1"/>
+      <w:numFmt w:val="bullet"/>
+      <w:lvlText w:val=""/>
+      <w:lvlJc w:val="left"/>
+      <w:pPr>
+        <w:ind w:left="2160" w:hanging="360"/>
+      </w:pPr>
+      <w:rPr>
+        <w:rFonts w:ascii="Wingdings" w:hAnsi="Wingdings" w:hint="default"/>
+      </w:rPr>
+    </w:lvl>
+    <w:lvl w:ilvl="3" w:tplc="04090001" w:tentative="1">
+      <w:start w:val="1"/>
+      <w:numFmt w:val="bullet"/>
+      <w:lvlText w:val=""/>
+      <w:lvlJc w:val="left"/>
+      <w:pPr>
+        <w:ind w:left="2880" w:hanging="360"/>
+      </w:pPr>
+      <w:rPr>
+        <w:rFonts w:ascii="Symbol" w:hAnsi="Symbol" w:hint="default"/>
+      </w:rPr>
+    </w:lvl>
+    <w:lvl w:ilvl="4" w:tplc="04090003" w:tentative="1">
+      <w:start w:val="1"/>
+      <w:numFmt w:val="bullet"/>
+      <w:lvlText w:val="o"/>
+      <w:lvlJc w:val="left"/>
+      <w:pPr>
+        <w:ind w:left="3600" w:hanging="360"/>
+      </w:pPr>
+      <w:rPr>
+        <w:rFonts w:ascii="Courier New" w:hAnsi="Courier New" w:cs="Courier New" w:hint="default"/>
+      </w:rPr>
+    </w:lvl>
+    <w:lvl w:ilvl="5" w:tplc="04090005" w:tentative="1">
+      <w:start w:val="1"/>
+      <w:numFmt w:val="bullet"/>
+      <w:lvlText w:val=""/>
+      <w:lvlJc w:val="left"/>
+      <w:pPr>
+        <w:ind w:left="4320" w:hanging="360"/>
+      </w:pPr>
+      <w:rPr>
+        <w:rFonts w:ascii="Wingdings" w:hAnsi="Wingdings" w:hint="default"/>
+      </w:rPr>
+    </w:lvl>
+    <w:lvl w:ilvl="6" w:tplc="04090001" w:tentative="1">
+      <w:start w:val="1"/>
+      <w:numFmt w:val="bullet"/>
+      <w:lvlText w:val=""/>
+      <w:lvlJc w:val="left"/>
+      <w:pPr>
+        <w:ind w:left="5040" w:hanging="360"/>
+      </w:pPr>
+      <w:rPr>
+        <w:rFonts w:ascii="Symbol" w:hAnsi="Symbol" w:hint="default"/>
+      </w:rPr>
+    </w:lvl>
+    <w:lvl w:ilvl="7" w:tplc="04090003" w:tentative="1">
+      <w:start w:val="1"/>
+      <w:numFmt w:val="bullet"/>
+      <w:lvlText w:val="o"/>
+      <w:lvlJc w:val="left"/>
+      <w:pPr>
+        <w:ind w:left="5760" w:hanging="360"/>
+      </w:pPr>
+      <w:rPr>
+        <w:rFonts w:ascii="Courier New" w:hAnsi="Courier New" w:cs="Courier New" w:hint="default"/>
+      </w:rPr>
+    </w:lvl>
+    <w:lvl w:ilvl="8" w:tplc="04090005" w:tentative="1">
+      <w:start w:val="1"/>
+      <w:numFmt w:val="bullet"/>
+      <w:lvlText w:val=""/>
+      <w:lvlJc w:val="left"/>
+      <w:pPr>
+        <w:ind w:left="6480" w:hanging="360"/>
+      </w:pPr>
+      <w:rPr>
+        <w:rFonts w:ascii="Wingdings" w:hAnsi="Wingdings" w:hint="default"/>
+      </w:rPr>
+    </w:lvl>
+  </w:abstractNum>
+  <w:abstractNum w:abstractNumId="1" w15:restartNumberingAfterBreak="0">
+    <w:nsid w:val="183D1321"/>
+    <w:multiLevelType w:val="hybridMultilevel"/>
+    <w:tmpl w:val="D422D6F8"/>
+    <w:lvl w:ilvl="0" w:tplc="093E14E4">
+      <w:start w:val="1"/>
+      <w:numFmt w:val="decimal"/>
+      <w:lvlText w:val="%1."/>
+      <w:lvlJc w:val="left"/>
+      <w:pPr>
+        <w:ind w:left="1080" w:hanging="360"/>
+      </w:pPr>
+      <w:rPr>
+        <w:rFonts w:hint="default"/>
+      </w:rPr>
+    </w:lvl>
+    <w:lvl w:ilvl="1" w:tplc="04090019" w:tentative="1">
+      <w:start w:val="1"/>
+      <w:numFmt w:val="lowerLetter"/>
+      <w:lvlText w:val="%2."/>
+      <w:lvlJc w:val="left"/>
+      <w:pPr>
+        <w:ind w:left="1800" w:hanging="360"/>
+      </w:pPr>
+    </w:lvl>
+    <w:lvl w:ilvl="2" w:tplc="0409001B" w:tentative="1">
+      <w:start w:val="1"/>
+      <w:numFmt w:val="lowerRoman"/>
+      <w:lvlText w:val="%3."/>
+      <w:lvlJc w:val="right"/>
+      <w:pPr>
+        <w:ind w:left="2520" w:hanging="180"/>
+      </w:pPr>
+    </w:lvl>
+    <w:lvl w:ilvl="3" w:tplc="0409000F" w:tentative="1">
+      <w:start w:val="1"/>
+      <w:numFmt w:val="decimal"/>
+      <w:lvlText w:val="%4."/>
+      <w:lvlJc w:val="left"/>
+      <w:pPr>
+        <w:ind w:left="3240" w:hanging="360"/>
+      </w:pPr>
+    </w:lvl>
+    <w:lvl w:ilvl="4" w:tplc="04090019" w:tentative="1">
+      <w:start w:val="1"/>
+      <w:numFmt w:val="lowerLetter"/>
+      <w:lvlText w:val="%5."/>
+      <w:lvlJc w:val="left"/>
+      <w:pPr>
+        <w:ind w:left="3960" w:hanging="360"/>
+      </w:pPr>
+    </w:lvl>
+    <w:lvl w:ilvl="5" w:tplc="0409001B" w:tentative="1">
+      <w:start w:val="1"/>
+      <w:numFmt w:val="lowerRoman"/>
+      <w:lvlText w:val="%6."/>
+      <w:lvlJc w:val="right"/>
+      <w:pPr>
+        <w:ind w:left="4680" w:hanging="180"/>
+      </w:pPr>
+    </w:lvl>
+    <w:lvl w:ilvl="6" w:tplc="0409000F" w:tentative="1">
+      <w:start w:val="1"/>
+      <w:numFmt w:val="decimal"/>
+      <w:lvlText w:val="%7."/>
+      <w:lvlJc w:val="left"/>
+      <w:pPr>
+        <w:ind w:left="5400" w:hanging="360"/>
+      </w:pPr>
+    </w:lvl>
+    <w:lvl w:ilvl="7" w:tplc="04090019" w:tentative="1">
+      <w:start w:val="1"/>
+      <w:numFmt w:val="lowerLetter"/>
+      <w:lvlText w:val="%8."/>
+      <w:lvlJc w:val="left"/>
+      <w:pPr>
+        <w:ind w:left="6120" w:hanging="360"/>
+      </w:pPr>
+    </w:lvl>
+    <w:lvl w:ilvl="8" w:tplc="0409001B" w:tentative="1">
+      <w:start w:val="1"/>
+      <w:numFmt w:val="lowerRoman"/>
+      <w:lvlText w:val="%9."/>
+      <w:lvlJc w:val="right"/>
+      <w:pPr>
+        <w:ind w:left="6840" w:hanging="180"/>
+      </w:pPr>
+    </w:lvl>
+  </w:abstractNum>
+  <w:abstractNum w:abstractNumId="2" w15:restartNumberingAfterBreak="0">
+    <w:nsid w:val="1BE96D3B"/>
+    <w:multiLevelType w:val="multilevel"/>
+    <w:tmpl w:val="49B2C886"/>
+    <w:lvl w:ilvl="0">
+      <w:start w:val="1"/>
+      <w:numFmt w:val="decimal"/>
+      <w:lvlText w:val="%1."/>
+      <w:lvlJc w:val="left"/>
+      <w:pPr>
+        <w:tabs>
+          <w:tab w:val="num" w:pos="720"/>
+        </w:tabs>
+        <w:ind w:left="720" w:hanging="360"/>
+      </w:pPr>
+      <w:rPr>
+        <w:rFonts w:ascii="Open Sans" w:eastAsia="Times New Roman" w:hAnsi="Open Sans" w:cs="Open Sans"/>
+        <w:sz w:val="20"/>
+      </w:rPr>
+    </w:lvl>
+    <w:lvl w:ilvl="1" w:tentative="1">
+      <w:start w:val="1"/>
+      <w:numFmt w:val="bullet"/>
+      <w:lvlText w:val="o"/>
+      <w:lvlJc w:val="left"/>
+      <w:pPr>
+        <w:tabs>
+          <w:tab w:val="num" w:pos="1440"/>
+        </w:tabs>
+        <w:ind w:left="1440" w:hanging="360"/>
+      </w:pPr>
+      <w:rPr>
+        <w:rFonts w:ascii="Courier New" w:hAnsi="Courier New" w:hint="default"/>
+        <w:sz w:val="20"/>
+      </w:rPr>
+    </w:lvl>
+    <w:lvl w:ilvl="2" w:tentative="1">
+      <w:start w:val="1"/>
+      <w:numFmt w:val="bullet"/>
+      <w:lvlText w:val=""/>
+      <w:lvlJc w:val="left"/>
+      <w:pPr>
+        <w:tabs>
+          <w:tab w:val="num" w:pos="2160"/>
+        </w:tabs>
+        <w:ind w:left="2160" w:hanging="360"/>
+      </w:pPr>
+      <w:rPr>
+        <w:rFonts w:ascii="Wingdings" w:hAnsi="Wingdings" w:hint="default"/>
+        <w:sz w:val="20"/>
+      </w:rPr>
+    </w:lvl>
+    <w:lvl w:ilvl="3" w:tentative="1">
+      <w:start w:val="1"/>
+      <w:numFmt w:val="bullet"/>
+      <w:lvlText w:val=""/>
+      <w:lvlJc w:val="left"/>
+      <w:pPr>
+        <w:tabs>
+          <w:tab w:val="num" w:pos="2880"/>
+        </w:tabs>
+        <w:ind w:left="2880" w:hanging="360"/>
+      </w:pPr>
+      <w:rPr>
+        <w:rFonts w:ascii="Wingdings" w:hAnsi="Wingdings" w:hint="default"/>
+        <w:sz w:val="20"/>
+      </w:rPr>
+    </w:lvl>
+    <w:lvl w:ilvl="4" w:tentative="1">
+      <w:start w:val="1"/>
+      <w:numFmt w:val="bullet"/>
+      <w:lvlText w:val=""/>
+      <w:lvlJc w:val="left"/>
+      <w:pPr>
+        <w:tabs>
+          <w:tab w:val="num" w:pos="3600"/>
+        </w:tabs>
+        <w:ind w:left="3600" w:hanging="360"/>
+      </w:pPr>
+      <w:rPr>
+        <w:rFonts w:ascii="Wingdings" w:hAnsi="Wingdings" w:hint="default"/>
+        <w:sz w:val="20"/>
+      </w:rPr>
+    </w:lvl>
+    <w:lvl w:ilvl="5" w:tentative="1">
+      <w:start w:val="1"/>
+      <w:numFmt w:val="bullet"/>
+      <w:lvlText w:val=""/>
+      <w:lvlJc w:val="left"/>
+      <w:pPr>
+        <w:tabs>
+          <w:tab w:val="num" w:pos="4320"/>
+        </w:tabs>
+        <w:ind w:left="4320" w:hanging="360"/>
+      </w:pPr>
+      <w:rPr>
+        <w:rFonts w:ascii="Wingdings" w:hAnsi="Wingdings" w:hint="default"/>
+        <w:sz w:val="20"/>
+      </w:rPr>
+    </w:lvl>
+    <w:lvl w:ilvl="6" w:tentative="1">
+      <w:start w:val="1"/>
+      <w:numFmt w:val="bullet"/>
+      <w:lvlText w:val=""/>
+      <w:lvlJc w:val="left"/>
+      <w:pPr>
+        <w:tabs>
+          <w:tab w:val="num" w:pos="5040"/>
+        </w:tabs>
+        <w:ind w:left="5040" w:hanging="360"/>
+      </w:pPr>
+      <w:rPr>
+        <w:rFonts w:ascii="Wingdings" w:hAnsi="Wingdings" w:hint="default"/>
+        <w:sz w:val="20"/>
+      </w:rPr>
+    </w:lvl>
+    <w:lvl w:ilvl="7" w:tentative="1">
+      <w:start w:val="1"/>
+      <w:numFmt w:val="bullet"/>
+      <w:lvlText w:val=""/>
+      <w:lvlJc w:val="left"/>
+      <w:pPr>
+        <w:tabs>
+          <w:tab w:val="num" w:pos="5760"/>
+        </w:tabs>
+        <w:ind w:left="5760" w:hanging="360"/>
+      </w:pPr>
+      <w:rPr>
+        <w:rFonts w:ascii="Wingdings" w:hAnsi="Wingdings" w:hint="default"/>
+        <w:sz w:val="20"/>
+      </w:rPr>
+    </w:lvl>
+    <w:lvl w:ilvl="8" w:tentative="1">
+      <w:start w:val="1"/>
+      <w:numFmt w:val="bullet"/>
+      <w:lvlText w:val=""/>
+      <w:lvlJc w:val="left"/>
+      <w:pPr>
+        <w:tabs>
+          <w:tab w:val="num" w:pos="6480"/>
+        </w:tabs>
+        <w:ind w:left="6480" w:hanging="360"/>
+      </w:pPr>
+      <w:rPr>
+        <w:rFonts w:ascii="Wingdings" w:hAnsi="Wingdings" w:hint="default"/>
+        <w:sz w:val="20"/>
+      </w:rPr>
+    </w:lvl>
+  </w:abstractNum>
+  <w:abstractNum w:abstractNumId="3" w15:restartNumberingAfterBreak="0">
+    <w:nsid w:val="384612B4"/>
+    <w:multiLevelType w:val="hybridMultilevel"/>
+    <w:tmpl w:val="60CE53AA"/>
+    <w:lvl w:ilvl="0" w:tplc="04090001">
+      <w:start w:val="1"/>
+      <w:numFmt w:val="bullet"/>
+      <w:lvlText w:val=""/>
+      <w:lvlJc w:val="left"/>
+      <w:pPr>
+        <w:ind w:left="720" w:hanging="360"/>
+      </w:pPr>
+      <w:rPr>
+        <w:rFonts w:ascii="Symbol" w:hAnsi="Symbol" w:hint="default"/>
+      </w:rPr>
+    </w:lvl>
+    <w:lvl w:ilvl="1" w:tplc="04090003" w:tentative="1">
+      <w:start w:val="1"/>
+      <w:numFmt w:val="bullet"/>
+      <w:lvlText w:val="o"/>
+      <w:lvlJc w:val="left"/>
+      <w:pPr>
+        <w:ind w:left="1440" w:hanging="360"/>
+      </w:pPr>
+      <w:rPr>
+        <w:rFonts w:ascii="Courier New" w:hAnsi="Courier New" w:cs="Courier New" w:hint="default"/>
+      </w:rPr>
+    </w:lvl>
+    <w:lvl w:ilvl="2" w:tplc="04090005" w:tentative="1">
+      <w:start w:val="1"/>
+      <w:numFmt w:val="bullet"/>
+      <w:lvlText w:val=""/>
+      <w:lvlJc w:val="left"/>
+      <w:pPr>
+        <w:ind w:left="2160" w:hanging="360"/>
+      </w:pPr>
+      <w:rPr>
+        <w:rFonts w:ascii="Wingdings" w:hAnsi="Wingdings" w:hint="default"/>
+      </w:rPr>
+    </w:lvl>
+    <w:lvl w:ilvl="3" w:tplc="04090001" w:tentative="1">
+      <w:start w:val="1"/>
+      <w:numFmt w:val="bullet"/>
+      <w:lvlText w:val=""/>
+      <w:lvlJc w:val="left"/>
+      <w:pPr>
+        <w:ind w:left="2880" w:hanging="360"/>
+      </w:pPr>
+      <w:rPr>
+        <w:rFonts w:ascii="Symbol" w:hAnsi="Symbol" w:hint="default"/>
+      </w:rPr>
+    </w:lvl>
+    <w:lvl w:ilvl="4" w:tplc="04090003" w:tentative="1">
+      <w:start w:val="1"/>
+      <w:numFmt w:val="bullet"/>
+      <w:lvlText w:val="o"/>
+      <w:lvlJc w:val="left"/>
+      <w:pPr>
+        <w:ind w:left="3600" w:hanging="360"/>
+      </w:pPr>
+      <w:rPr>
+        <w:rFonts w:ascii="Courier New" w:hAnsi="Courier New" w:cs="Courier New" w:hint="default"/>
+      </w:rPr>
+    </w:lvl>
+    <w:lvl w:ilvl="5" w:tplc="04090005" w:tentative="1">
+      <w:start w:val="1"/>
+      <w:numFmt w:val="bullet"/>
+      <w:lvlText w:val=""/>
+      <w:lvlJc w:val="left"/>
+      <w:pPr>
+        <w:ind w:left="4320" w:hanging="360"/>
+      </w:pPr>
+      <w:rPr>
+        <w:rFonts w:ascii="Wingdings" w:hAnsi="Wingdings" w:hint="default"/>
+      </w:rPr>
+    </w:lvl>
+    <w:lvl w:ilvl="6" w:tplc="04090001" w:tentative="1">
+      <w:start w:val="1"/>
+      <w:numFmt w:val="bullet"/>
+      <w:lvlText w:val=""/>
+      <w:lvlJc w:val="left"/>
+      <w:pPr>
+        <w:ind w:left="5040" w:hanging="360"/>
+      </w:pPr>
+      <w:rPr>
+        <w:rFonts w:ascii="Symbol" w:hAnsi="Symbol" w:hint="default"/>
+      </w:rPr>
+    </w:lvl>
+    <w:lvl w:ilvl="7" w:tplc="04090003" w:tentative="1">
+      <w:start w:val="1"/>
+      <w:numFmt w:val="bullet"/>
+      <w:lvlText w:val="o"/>
+      <w:lvlJc w:val="left"/>
+      <w:pPr>
+        <w:ind w:left="5760" w:hanging="360"/>
+      </w:pPr>
+      <w:rPr>
+        <w:rFonts w:ascii="Courier New" w:hAnsi="Courier New" w:cs="Courier New" w:hint="default"/>
+      </w:rPr>
+    </w:lvl>
+    <w:lvl w:ilvl="8" w:tplc="04090005" w:tentative="1">
+      <w:start w:val="1"/>
+      <w:numFmt w:val="bullet"/>
+      <w:lvlText w:val=""/>
+      <w:lvlJc w:val="left"/>
+      <w:pPr>
+        <w:ind w:left="6480" w:hanging="360"/>
+      </w:pPr>
+      <w:rPr>
+        <w:rFonts w:ascii="Wingdings" w:hAnsi="Wingdings" w:hint="default"/>
+      </w:rPr>
+    </w:lvl>
+  </w:abstractNum>
+  <w:abstractNum w:abstractNumId="4" w15:restartNumberingAfterBreak="0">
     <w:nsid w:val="4A642143"/>
     <w:multiLevelType w:val="hybridMultilevel"/>
     <w:tmpl w:val="F8EE5068"/>
@@ -688,7 +1896,7 @@
       </w:rPr>
     </w:lvl>
   </w:abstractNum>
-  <w:abstractNum w:abstractNumId="1" w15:restartNumberingAfterBreak="0">
+  <w:abstractNum w:abstractNumId="5" w15:restartNumberingAfterBreak="0">
     <w:nsid w:val="573E1EAA"/>
     <w:multiLevelType w:val="multilevel"/>
     <w:tmpl w:val="54304774"/>
@@ -837,7 +2045,7 @@
       </w:rPr>
     </w:lvl>
   </w:abstractNum>
-  <w:abstractNum w:abstractNumId="2" w15:restartNumberingAfterBreak="0">
+  <w:abstractNum w:abstractNumId="6" w15:restartNumberingAfterBreak="0">
     <w:nsid w:val="6F5737E1"/>
     <w:multiLevelType w:val="hybridMultilevel"/>
     <w:tmpl w:val="22A21080"/>
@@ -950,7 +2158,120 @@
       </w:rPr>
     </w:lvl>
   </w:abstractNum>
-  <w:abstractNum w:abstractNumId="3" w15:restartNumberingAfterBreak="0">
+  <w:abstractNum w:abstractNumId="7" w15:restartNumberingAfterBreak="0">
+    <w:nsid w:val="77C4622B"/>
+    <w:multiLevelType w:val="hybridMultilevel"/>
+    <w:tmpl w:val="B7FAA246"/>
+    <w:lvl w:ilvl="0" w:tplc="04090001">
+      <w:start w:val="1"/>
+      <w:numFmt w:val="bullet"/>
+      <w:lvlText w:val=""/>
+      <w:lvlJc w:val="left"/>
+      <w:pPr>
+        <w:ind w:left="720" w:hanging="360"/>
+      </w:pPr>
+      <w:rPr>
+        <w:rFonts w:ascii="Symbol" w:hAnsi="Symbol" w:hint="default"/>
+      </w:rPr>
+    </w:lvl>
+    <w:lvl w:ilvl="1" w:tplc="04090003" w:tentative="1">
+      <w:start w:val="1"/>
+      <w:numFmt w:val="bullet"/>
+      <w:lvlText w:val="o"/>
+      <w:lvlJc w:val="left"/>
+      <w:pPr>
+        <w:ind w:left="1440" w:hanging="360"/>
+      </w:pPr>
+      <w:rPr>
+        <w:rFonts w:ascii="Courier New" w:hAnsi="Courier New" w:cs="Courier New" w:hint="default"/>
+      </w:rPr>
+    </w:lvl>
+    <w:lvl w:ilvl="2" w:tplc="04090005" w:tentative="1">
+      <w:start w:val="1"/>
+      <w:numFmt w:val="bullet"/>
+      <w:lvlText w:val=""/>
+      <w:lvlJc w:val="left"/>
+      <w:pPr>
+        <w:ind w:left="2160" w:hanging="360"/>
+      </w:pPr>
+      <w:rPr>
+        <w:rFonts w:ascii="Wingdings" w:hAnsi="Wingdings" w:hint="default"/>
+      </w:rPr>
+    </w:lvl>
+    <w:lvl w:ilvl="3" w:tplc="04090001" w:tentative="1">
+      <w:start w:val="1"/>
+      <w:numFmt w:val="bullet"/>
+      <w:lvlText w:val=""/>
+      <w:lvlJc w:val="left"/>
+      <w:pPr>
+        <w:ind w:left="2880" w:hanging="360"/>
+      </w:pPr>
+      <w:rPr>
+        <w:rFonts w:ascii="Symbol" w:hAnsi="Symbol" w:hint="default"/>
+      </w:rPr>
+    </w:lvl>
+    <w:lvl w:ilvl="4" w:tplc="04090003" w:tentative="1">
+      <w:start w:val="1"/>
+      <w:numFmt w:val="bullet"/>
+      <w:lvlText w:val="o"/>
+      <w:lvlJc w:val="left"/>
+      <w:pPr>
+        <w:ind w:left="3600" w:hanging="360"/>
+      </w:pPr>
+      <w:rPr>
+        <w:rFonts w:ascii="Courier New" w:hAnsi="Courier New" w:cs="Courier New" w:hint="default"/>
+      </w:rPr>
+    </w:lvl>
+    <w:lvl w:ilvl="5" w:tplc="04090005" w:tentative="1">
+      <w:start w:val="1"/>
+      <w:numFmt w:val="bullet"/>
+      <w:lvlText w:val=""/>
+      <w:lvlJc w:val="left"/>
+      <w:pPr>
+        <w:ind w:left="4320" w:hanging="360"/>
+      </w:pPr>
+      <w:rPr>
+        <w:rFonts w:ascii="Wingdings" w:hAnsi="Wingdings" w:hint="default"/>
+      </w:rPr>
+    </w:lvl>
+    <w:lvl w:ilvl="6" w:tplc="04090001" w:tentative="1">
+      <w:start w:val="1"/>
+      <w:numFmt w:val="bullet"/>
+      <w:lvlText w:val=""/>
+      <w:lvlJc w:val="left"/>
+      <w:pPr>
+        <w:ind w:left="5040" w:hanging="360"/>
+      </w:pPr>
+      <w:rPr>
+        <w:rFonts w:ascii="Symbol" w:hAnsi="Symbol" w:hint="default"/>
+      </w:rPr>
+    </w:lvl>
+    <w:lvl w:ilvl="7" w:tplc="04090003" w:tentative="1">
+      <w:start w:val="1"/>
+      <w:numFmt w:val="bullet"/>
+      <w:lvlText w:val="o"/>
+      <w:lvlJc w:val="left"/>
+      <w:pPr>
+        <w:ind w:left="5760" w:hanging="360"/>
+      </w:pPr>
+      <w:rPr>
+        <w:rFonts w:ascii="Courier New" w:hAnsi="Courier New" w:cs="Courier New" w:hint="default"/>
+      </w:rPr>
+    </w:lvl>
+    <w:lvl w:ilvl="8" w:tplc="04090005" w:tentative="1">
+      <w:start w:val="1"/>
+      <w:numFmt w:val="bullet"/>
+      <w:lvlText w:val=""/>
+      <w:lvlJc w:val="left"/>
+      <w:pPr>
+        <w:ind w:left="6480" w:hanging="360"/>
+      </w:pPr>
+      <w:rPr>
+        <w:rFonts w:ascii="Wingdings" w:hAnsi="Wingdings" w:hint="default"/>
+      </w:rPr>
+    </w:lvl>
+  </w:abstractNum>
+  <w:abstractNum w:abstractNumId="8" w15:restartNumberingAfterBreak="0">
     <w:nsid w:val="7A347814"/>
     <w:multiLevelType w:val="multilevel"/>
     <w:tmpl w:val="54304774"/>
@@ -1101,16 +2422,31 @@
     </w:lvl>
   </w:abstractNum>
   <w:num w:numId="1" w16cid:durableId="66079138">
+    <w:abstractNumId w:val="4"/>
+  </w:num>
+  <w:num w:numId="2" w16cid:durableId="1431966833">
+    <w:abstractNumId w:val="5"/>
+  </w:num>
+  <w:num w:numId="3" w16cid:durableId="1771269680">
+    <w:abstractNumId w:val="8"/>
+  </w:num>
+  <w:num w:numId="4" w16cid:durableId="661199573">
+    <w:abstractNumId w:val="6"/>
+  </w:num>
+  <w:num w:numId="5" w16cid:durableId="2110461822">
+    <w:abstractNumId w:val="1"/>
+  </w:num>
+  <w:num w:numId="6" w16cid:durableId="1881162702">
+    <w:abstractNumId w:val="2"/>
+  </w:num>
+  <w:num w:numId="7" w16cid:durableId="1199005313">
+    <w:abstractNumId w:val="3"/>
+  </w:num>
+  <w:num w:numId="8" w16cid:durableId="153110399">
     <w:abstractNumId w:val="0"/>
   </w:num>
-  <w:num w:numId="2" w16cid:durableId="1431966833">
-    <w:abstractNumId w:val="1"/>
-  </w:num>
-  <w:num w:numId="3" w16cid:durableId="1771269680">
-    <w:abstractNumId w:val="3"/>
-  </w:num>
-  <w:num w:numId="4" w16cid:durableId="661199573">
-    <w:abstractNumId w:val="2"/>
+  <w:num w:numId="9" w16cid:durableId="1031610669">
+    <w:abstractNumId w:val="7"/>
   </w:num>
 </w:numbering>
 </file>

</xml_diff>